<commit_message>
Add chapter on competitor algorithm performance and real loitering cases
新增第 6 章：算法效果与真实徘徊事件 Case 调研——行业无公开准召数据的结论、
第三方横评可用数据点（Tom's Guide 六摄横评、聚合评分）、7 条真实误报/失准
case 库（慢走误判逗留、陌生人误归熟人、Nest 人脸八年失准等）及映射到 PRD
的行动建议

Co-Authored-By: Claude Fable 5 <noreply@anthropic.com>
Claude-Session: https://claude.ai/code/session_01C4rKKS9mVHigxegSx9yWej
</commit_message>
<xml_diff>
--- a/徘徊检测竞品调研报告.docx
+++ b/徘徊检测竞品调研报告.docx
@@ -3737,7 +3737,1158 @@
           <w:color w:val="1F4E79"/>
           <w:sz w:val="30"/>
         </w:rPr>
-        <w:t>6. 参考资料</w:t>
+        <w:t>6. 算法效果与真实徘徊事件 Case 调研</w:t>
+      </w:r>
+    </w:p>
+    <w:p>
+      <w:pPr>
+        <w:spacing w:before="200" w:after="120"/>
+        <w:outlineLvl w:val="2"/>
+      </w:pPr>
+      <w:r>
+        <w:rPr>
+          <w:rFonts w:ascii="Calibri" w:hAnsi="Calibri" w:eastAsia="微软雅黑"/>
+          <w:b/>
+          <w:color w:val="1F4E79"/>
+          <w:sz w:val="25"/>
+        </w:rPr>
+        <w:t>6.1 先说结论：行业没有可比的准召数据</w:t>
+      </w:r>
+    </w:p>
+    <w:p>
+      <w:pPr>
+        <w:pStyle w:val="ListBullet"/>
+        <w:spacing w:after="40"/>
+      </w:pPr>
+      <w:r>
+        <w:rPr>
+          <w:rFonts w:ascii="Calibri" w:hAnsi="Calibri" w:eastAsia="微软雅黑"/>
+          <w:b/>
+          <w:sz w:val="21"/>
+        </w:rPr>
+        <w:t>厂商侧</w:t>
+      </w:r>
+      <w:r>
+        <w:rPr>
+          <w:rFonts w:ascii="Calibri" w:hAnsi="Calibri" w:eastAsia="微软雅黑"/>
+          <w:b w:val="0"/>
+          <w:sz w:val="21"/>
+        </w:rPr>
+        <w:t>：7 家竞品均</w:t>
+      </w:r>
+      <w:r>
+        <w:rPr>
+          <w:rFonts w:ascii="Calibri" w:hAnsi="Calibri" w:eastAsia="微软雅黑"/>
+          <w:b/>
+          <w:sz w:val="21"/>
+        </w:rPr>
+        <w:t>不公开</w:t>
+      </w:r>
+      <w:r>
+        <w:rPr>
+          <w:rFonts w:ascii="Calibri" w:hAnsi="Calibri" w:eastAsia="微软雅黑"/>
+          <w:b w:val="0"/>
+          <w:sz w:val="21"/>
+        </w:rPr>
+        <w:t>任何徘徊/人脸/检测的精确率、召回率或误报率指标。唯一的数字是 eufy 宣传 BionicMind 自学习后人脸识别"可达 99.9%"，属营销口径，无测试集、无 FAR 条件，不可采信为对标基线。</w:t>
+      </w:r>
+    </w:p>
+    <w:p>
+      <w:pPr>
+        <w:pStyle w:val="ListBullet"/>
+        <w:spacing w:after="40"/>
+      </w:pPr>
+      <w:r>
+        <w:rPr>
+          <w:rFonts w:ascii="Calibri" w:hAnsi="Calibri" w:eastAsia="微软雅黑"/>
+          <w:b/>
+          <w:sz w:val="21"/>
+        </w:rPr>
+        <w:t>第三方侧</w:t>
+      </w:r>
+      <w:r>
+        <w:rPr>
+          <w:rFonts w:ascii="Calibri" w:hAnsi="Calibri" w:eastAsia="微软雅黑"/>
+          <w:b w:val="0"/>
+          <w:sz w:val="21"/>
+        </w:rPr>
+        <w:t>：Tom's Guide、Wirecutter、RTINGS、Security.org 等评测机构做过</w:t>
+      </w:r>
+      <w:r>
+        <w:rPr>
+          <w:rFonts w:ascii="Calibri" w:hAnsi="Calibri" w:eastAsia="微软雅黑"/>
+          <w:b/>
+          <w:sz w:val="21"/>
+        </w:rPr>
+        <w:t>人形/包裹检测与 AI 描述的横评</w:t>
+      </w:r>
+      <w:r>
+        <w:rPr>
+          <w:rFonts w:ascii="Calibri" w:hAnsi="Calibri" w:eastAsia="微软雅黑"/>
+          <w:b w:val="0"/>
+          <w:sz w:val="21"/>
+        </w:rPr>
+        <w:t>，但全部是少量场景的手工定性测试；</w:t>
+      </w:r>
+      <w:r>
+        <w:rPr>
+          <w:rFonts w:ascii="Calibri" w:hAnsi="Calibri" w:eastAsia="微软雅黑"/>
+          <w:b/>
+          <w:sz w:val="21"/>
+        </w:rPr>
+        <w:t>没有任何机构建立过"徘徊事件"的标准化测试集与量化评测</w:t>
+      </w:r>
+      <w:r>
+        <w:rPr>
+          <w:rFonts w:ascii="Calibri" w:hAnsi="Calibri" w:eastAsia="微软雅黑"/>
+          <w:b w:val="0"/>
+          <w:sz w:val="21"/>
+        </w:rPr>
+        <w:t>。这直接印证本报告第 4 章建议：我方 PRD 的量化准召承诺（P≥90%/R≥85%、FAR≤1 次/路/天）在行业内没有对标物，本身就是差异化资产。</w:t>
+      </w:r>
+    </w:p>
+    <w:p>
+      <w:pPr>
+        <w:spacing w:before="200" w:after="120"/>
+        <w:outlineLvl w:val="2"/>
+      </w:pPr>
+      <w:r>
+        <w:rPr>
+          <w:rFonts w:ascii="Calibri" w:hAnsi="Calibri" w:eastAsia="微软雅黑"/>
+          <w:b/>
+          <w:color w:val="1F4E79"/>
+          <w:sz w:val="25"/>
+        </w:rPr>
+        <w:t>6.2 第三方横评的可用数据点</w:t>
+      </w:r>
+    </w:p>
+    <w:tbl>
+      <w:tblPr>
+        <w:tblStyle w:val="TableGrid"/>
+        <w:tblW w:type="auto" w:w="0"/>
+        <w:jc w:val="center"/>
+        <w:tblLook w:firstColumn="1" w:firstRow="1" w:lastColumn="0" w:lastRow="0" w:noHBand="0" w:noVBand="1" w:val="04A0"/>
+      </w:tblPr>
+      <w:tblGrid>
+        <w:gridCol w:w="3173"/>
+        <w:gridCol w:w="3173"/>
+        <w:gridCol w:w="3173"/>
+      </w:tblGrid>
+      <w:tr>
+        <w:tc>
+          <w:tcPr>
+            <w:tcW w:type="dxa" w:w="3173"/>
+            <w:shd w:val="clear" w:fill="1F4E79"/>
+          </w:tcPr>
+          <w:p>
+            <w:r>
+              <w:rPr>
+                <w:rFonts w:ascii="Calibri" w:hAnsi="Calibri" w:eastAsia="微软雅黑"/>
+                <w:b/>
+                <w:color w:val="FFFFFF"/>
+                <w:sz w:val="20"/>
+              </w:rPr>
+              <w:t>来源</w:t>
+            </w:r>
+          </w:p>
+        </w:tc>
+        <w:tc>
+          <w:tcPr>
+            <w:tcW w:type="dxa" w:w="3173"/>
+            <w:shd w:val="clear" w:fill="1F4E79"/>
+          </w:tcPr>
+          <w:p>
+            <w:r>
+              <w:rPr>
+                <w:rFonts w:ascii="Calibri" w:hAnsi="Calibri" w:eastAsia="微软雅黑"/>
+                <w:b/>
+                <w:color w:val="FFFFFF"/>
+                <w:sz w:val="20"/>
+              </w:rPr>
+              <w:t>测试对象</w:t>
+            </w:r>
+          </w:p>
+        </w:tc>
+        <w:tc>
+          <w:tcPr>
+            <w:tcW w:type="dxa" w:w="3173"/>
+            <w:shd w:val="clear" w:fill="1F4E79"/>
+          </w:tcPr>
+          <w:p>
+            <w:r>
+              <w:rPr>
+                <w:rFonts w:ascii="Calibri" w:hAnsi="Calibri" w:eastAsia="微软雅黑"/>
+                <w:b/>
+                <w:color w:val="FFFFFF"/>
+                <w:sz w:val="20"/>
+              </w:rPr>
+              <w:t>关键结论</w:t>
+            </w:r>
+          </w:p>
+        </w:tc>
+      </w:tr>
+      <w:tr>
+        <w:tc>
+          <w:tcPr>
+            <w:tcW w:type="dxa" w:w="3173"/>
+          </w:tcPr>
+          <w:p>
+            <w:r>
+              <w:rPr>
+                <w:rFonts w:ascii="Calibri" w:hAnsi="Calibri" w:eastAsia="微软雅黑"/>
+                <w:b w:val="0"/>
+                <w:sz w:val="19"/>
+              </w:rPr>
+              <w:t>Tom's Guide 六摄像头 AI 横评（2026）</w:t>
+            </w:r>
+          </w:p>
+        </w:tc>
+        <w:tc>
+          <w:tcPr>
+            <w:tcW w:type="dxa" w:w="3173"/>
+          </w:tcPr>
+          <w:p>
+            <w:r>
+              <w:rPr>
+                <w:rFonts w:ascii="Calibri" w:hAnsi="Calibri" w:eastAsia="微软雅黑"/>
+                <w:b w:val="0"/>
+                <w:sz w:val="19"/>
+              </w:rPr>
+              <w:t>Nest、Arlo、Wyze、Ring、Blink、eufy</w:t>
+            </w:r>
+          </w:p>
+        </w:tc>
+        <w:tc>
+          <w:tcPr>
+            <w:tcW w:type="dxa" w:w="3173"/>
+          </w:tcPr>
+          <w:p>
+            <w:r>
+              <w:rPr>
+                <w:rFonts w:ascii="Calibri" w:hAnsi="Calibri" w:eastAsia="微软雅黑"/>
+                <w:b w:val="0"/>
+                <w:sz w:val="19"/>
+              </w:rPr>
+              <w:t>定性排名：</w:t>
+            </w:r>
+            <w:r>
+              <w:rPr>
+                <w:rFonts w:ascii="Calibri" w:hAnsi="Calibri" w:eastAsia="微软雅黑"/>
+                <w:b/>
+                <w:sz w:val="19"/>
+              </w:rPr>
+              <w:t>Google Nest 的生成式 AI 体验最完善</w:t>
+            </w:r>
+            <w:r>
+              <w:rPr>
+                <w:rFonts w:ascii="Calibri" w:hAnsi="Calibri" w:eastAsia="微软雅黑"/>
+                <w:b w:val="0"/>
+                <w:sz w:val="19"/>
+              </w:rPr>
+              <w:t>（描述质量、对话式搜索）；Arlo/Blink 的 AI 几乎全依赖云端+订阅；Nest 人形检测在端侧、活动区域免费；eufy 人形检测在 HomeBase 3 本地免订阅。未给出准召数字</w:t>
+            </w:r>
+          </w:p>
+        </w:tc>
+      </w:tr>
+      <w:tr>
+        <w:tc>
+          <w:tcPr>
+            <w:tcW w:type="dxa" w:w="3173"/>
+            <w:shd w:val="clear" w:fill="EDF2F8"/>
+          </w:tcPr>
+          <w:p>
+            <w:r>
+              <w:rPr>
+                <w:rFonts w:ascii="Calibri" w:hAnsi="Calibri" w:eastAsia="微软雅黑"/>
+                <w:b w:val="0"/>
+                <w:sz w:val="19"/>
+              </w:rPr>
+              <w:t>SmartHomeExplorer 聚合评分（聚合 Wirecutter/Tom's Guide/RTINGS/Security.org，2026-05）</w:t>
+            </w:r>
+          </w:p>
+        </w:tc>
+        <w:tc>
+          <w:tcPr>
+            <w:tcW w:type="dxa" w:w="3173"/>
+            <w:shd w:val="clear" w:fill="EDF2F8"/>
+          </w:tcPr>
+          <w:p>
+            <w:r>
+              <w:rPr>
+                <w:rFonts w:ascii="Calibri" w:hAnsi="Calibri" w:eastAsia="微软雅黑"/>
+                <w:b w:val="0"/>
+                <w:sz w:val="19"/>
+              </w:rPr>
+              <w:t>12 款摄像头</w:t>
+            </w:r>
+          </w:p>
+        </w:tc>
+        <w:tc>
+          <w:tcPr>
+            <w:tcW w:type="dxa" w:w="3173"/>
+            <w:shd w:val="clear" w:fill="EDF2F8"/>
+          </w:tcPr>
+          <w:p>
+            <w:r>
+              <w:rPr>
+                <w:rFonts w:ascii="Calibri" w:hAnsi="Calibri" w:eastAsia="微软雅黑"/>
+                <w:b w:val="0"/>
+                <w:sz w:val="19"/>
+              </w:rPr>
+              <w:t>eufy SoloCam S340 综合分最高（8.7）；Wyze Cam v4 误报率显著高于 Arlo/eufy。</w:t>
+            </w:r>
+            <w:r>
+              <w:rPr>
+                <w:rFonts w:ascii="Calibri" w:hAnsi="Calibri" w:eastAsia="微软雅黑"/>
+                <w:b/>
+                <w:sz w:val="19"/>
+              </w:rPr>
+              <w:t>极端 case：某受测摄像头 8 小时发出 47 条误报，却漏掉了真实的包裹小偷</w:t>
+            </w:r>
+            <w:r>
+              <w:rPr>
+                <w:rFonts w:ascii="Calibri" w:hAnsi="Calibri" w:eastAsia="微软雅黑"/>
+                <w:b w:val="0"/>
+                <w:sz w:val="19"/>
+              </w:rPr>
+              <w:t>——说明"告警多"与"抓得住"完全是两回事，与我方"FAR 与召回并列考核"的口径一致</w:t>
+            </w:r>
+          </w:p>
+        </w:tc>
+      </w:tr>
+      <w:tr>
+        <w:tc>
+          <w:tcPr>
+            <w:tcW w:type="dxa" w:w="3173"/>
+          </w:tcPr>
+          <w:p>
+            <w:r>
+              <w:rPr>
+                <w:rFonts w:ascii="Calibri" w:hAnsi="Calibri" w:eastAsia="微软雅黑"/>
+                <w:b w:val="0"/>
+                <w:sz w:val="19"/>
+              </w:rPr>
+              <w:t>Ring Video Descriptions 上手实测（MakeUseOf 等）</w:t>
+            </w:r>
+          </w:p>
+        </w:tc>
+        <w:tc>
+          <w:tcPr>
+            <w:tcW w:type="dxa" w:w="3173"/>
+          </w:tcPr>
+          <w:p>
+            <w:r>
+              <w:rPr>
+                <w:rFonts w:ascii="Calibri" w:hAnsi="Calibri" w:eastAsia="微软雅黑"/>
+                <w:b w:val="0"/>
+                <w:sz w:val="19"/>
+              </w:rPr>
+              <w:t>Ring AI 描述</w:t>
+            </w:r>
+          </w:p>
+        </w:tc>
+        <w:tc>
+          <w:tcPr>
+            <w:tcW w:type="dxa" w:w="3173"/>
+          </w:tcPr>
+          <w:p>
+            <w:r>
+              <w:rPr>
+                <w:rFonts w:ascii="Calibri" w:hAnsi="Calibri" w:eastAsia="微软雅黑"/>
+                <w:b w:val="0"/>
+                <w:sz w:val="19"/>
+              </w:rPr>
+              <w:t>认包裹"多数时候准确"，偶有描述错误；Ring 为此内置 VLM 实时护栏 + 用户纠错反馈训练机制</w:t>
+            </w:r>
+          </w:p>
+        </w:tc>
+      </w:tr>
+    </w:tbl>
+    <w:p>
+      <w:pPr>
+        <w:spacing w:after="40"/>
+      </w:pPr>
+    </w:p>
+    <w:p>
+      <w:pPr>
+        <w:spacing w:before="200" w:after="120"/>
+        <w:outlineLvl w:val="2"/>
+      </w:pPr>
+      <w:r>
+        <w:rPr>
+          <w:rFonts w:ascii="Calibri" w:hAnsi="Calibri" w:eastAsia="微软雅黑"/>
+          <w:b/>
+          <w:color w:val="1F4E79"/>
+          <w:sz w:val="25"/>
+        </w:rPr>
+        <w:t>6.3 真实徘徊/识别事件 Case 库（来自评测与用户论坛）</w:t>
+      </w:r>
+    </w:p>
+    <w:p>
+      <w:pPr>
+        <w:spacing w:after="120"/>
+      </w:pPr>
+      <w:r>
+        <w:rPr>
+          <w:rFonts w:ascii="Calibri" w:hAnsi="Calibri" w:eastAsia="微软雅黑"/>
+          <w:b w:val="0"/>
+          <w:sz w:val="21"/>
+        </w:rPr>
+        <w:t>以下 case 全部来自公开评测和厂商社区，按"对我方 PRD 的映射"整理：</w:t>
+      </w:r>
+    </w:p>
+    <w:tbl>
+      <w:tblPr>
+        <w:tblStyle w:val="TableGrid"/>
+        <w:tblW w:type="auto" w:w="0"/>
+        <w:jc w:val="center"/>
+        <w:tblLook w:firstColumn="1" w:firstRow="1" w:lastColumn="0" w:lastRow="0" w:noHBand="0" w:noVBand="1" w:val="04A0"/>
+      </w:tblPr>
+      <w:tblGrid>
+        <w:gridCol w:w="2379"/>
+        <w:gridCol w:w="2379"/>
+        <w:gridCol w:w="2379"/>
+        <w:gridCol w:w="2379"/>
+      </w:tblGrid>
+      <w:tr>
+        <w:tc>
+          <w:tcPr>
+            <w:tcW w:type="dxa" w:w="2379"/>
+            <w:shd w:val="clear" w:fill="1F4E79"/>
+          </w:tcPr>
+          <w:p>
+            <w:r>
+              <w:rPr>
+                <w:rFonts w:ascii="Calibri" w:hAnsi="Calibri" w:eastAsia="微软雅黑"/>
+                <w:b/>
+                <w:color w:val="FFFFFF"/>
+                <w:sz w:val="20"/>
+              </w:rPr>
+              <w:t>#</w:t>
+            </w:r>
+          </w:p>
+        </w:tc>
+        <w:tc>
+          <w:tcPr>
+            <w:tcW w:type="dxa" w:w="2379"/>
+            <w:shd w:val="clear" w:fill="1F4E79"/>
+          </w:tcPr>
+          <w:p>
+            <w:r>
+              <w:rPr>
+                <w:rFonts w:ascii="Calibri" w:hAnsi="Calibri" w:eastAsia="微软雅黑"/>
+                <w:b/>
+                <w:color w:val="FFFFFF"/>
+                <w:sz w:val="20"/>
+              </w:rPr>
+              <w:t>Case（来源）</w:t>
+            </w:r>
+          </w:p>
+        </w:tc>
+        <w:tc>
+          <w:tcPr>
+            <w:tcW w:type="dxa" w:w="2379"/>
+            <w:shd w:val="clear" w:fill="1F4E79"/>
+          </w:tcPr>
+          <w:p>
+            <w:r>
+              <w:rPr>
+                <w:rFonts w:ascii="Calibri" w:hAnsi="Calibri" w:eastAsia="微软雅黑"/>
+                <w:b/>
+                <w:color w:val="FFFFFF"/>
+                <w:sz w:val="20"/>
+              </w:rPr>
+              <w:t>现象</w:t>
+            </w:r>
+          </w:p>
+        </w:tc>
+        <w:tc>
+          <w:tcPr>
+            <w:tcW w:type="dxa" w:w="2379"/>
+            <w:shd w:val="clear" w:fill="1F4E79"/>
+          </w:tcPr>
+          <w:p>
+            <w:r>
+              <w:rPr>
+                <w:rFonts w:ascii="Calibri" w:hAnsi="Calibri" w:eastAsia="微软雅黑"/>
+                <w:b/>
+                <w:color w:val="FFFFFF"/>
+                <w:sz w:val="20"/>
+              </w:rPr>
+              <w:t>对我方 PRD 的映射</w:t>
+            </w:r>
+          </w:p>
+        </w:tc>
+      </w:tr>
+      <w:tr>
+        <w:tc>
+          <w:tcPr>
+            <w:tcW w:type="dxa" w:w="2379"/>
+          </w:tcPr>
+          <w:p>
+            <w:r>
+              <w:rPr>
+                <w:rFonts w:ascii="Calibri" w:hAnsi="Calibri" w:eastAsia="微软雅黑"/>
+                <w:b w:val="0"/>
+                <w:sz w:val="19"/>
+              </w:rPr>
+              <w:t>C1</w:t>
+            </w:r>
+          </w:p>
+        </w:tc>
+        <w:tc>
+          <w:tcPr>
+            <w:tcW w:type="dxa" w:w="2379"/>
+          </w:tcPr>
+          <w:p>
+            <w:r>
+              <w:rPr>
+                <w:rFonts w:ascii="Calibri" w:hAnsi="Calibri" w:eastAsia="微软雅黑"/>
+                <w:b w:val="0"/>
+                <w:sz w:val="19"/>
+              </w:rPr>
+              <w:t>Aqara G5 Pro 评测（HomeKitNews）</w:t>
+            </w:r>
+          </w:p>
+        </w:tc>
+        <w:tc>
+          <w:tcPr>
+            <w:tcW w:type="dxa" w:w="2379"/>
+          </w:tcPr>
+          <w:p>
+            <w:r>
+              <w:rPr>
+                <w:rFonts w:ascii="Calibri" w:hAnsi="Calibri" w:eastAsia="微软雅黑"/>
+                <w:b/>
+                <w:sz w:val="19"/>
+              </w:rPr>
+              <w:t>15 岁少年因为走得慢，被系统判定为"逗留"触发告警</w:t>
+            </w:r>
+            <w:r>
+              <w:rPr>
+                <w:rFonts w:ascii="Calibri" w:hAnsi="Calibri" w:eastAsia="微软雅黑"/>
+                <w:b w:val="0"/>
+                <w:sz w:val="19"/>
+              </w:rPr>
+              <w:t>——慢速路过被误判徘徊</w:t>
+            </w:r>
+          </w:p>
+        </w:tc>
+        <w:tc>
+          <w:tcPr>
+            <w:tcW w:type="dxa" w:w="2379"/>
+          </w:tcPr>
+          <w:p>
+            <w:r>
+              <w:rPr>
+                <w:rFonts w:ascii="Calibri" w:hAnsi="Calibri" w:eastAsia="微软雅黑"/>
+                <w:b w:val="0"/>
+                <w:sz w:val="19"/>
+              </w:rPr>
+              <w:t>直接对应 4.3"缓慢直线路过排除"开关的设计动机；也说明纯时长阈值方案（我方本期口径）必然产生此类误报，需在测试集中放入"慢速路过"负样本并监控其占比</w:t>
+            </w:r>
+          </w:p>
+        </w:tc>
+      </w:tr>
+      <w:tr>
+        <w:tc>
+          <w:tcPr>
+            <w:tcW w:type="dxa" w:w="2379"/>
+            <w:shd w:val="clear" w:fill="EDF2F8"/>
+          </w:tcPr>
+          <w:p>
+            <w:r>
+              <w:rPr>
+                <w:rFonts w:ascii="Calibri" w:hAnsi="Calibri" w:eastAsia="微软雅黑"/>
+                <w:b w:val="0"/>
+                <w:sz w:val="19"/>
+              </w:rPr>
+              <w:t>C2</w:t>
+            </w:r>
+          </w:p>
+        </w:tc>
+        <w:tc>
+          <w:tcPr>
+            <w:tcW w:type="dxa" w:w="2379"/>
+            <w:shd w:val="clear" w:fill="EDF2F8"/>
+          </w:tcPr>
+          <w:p>
+            <w:r>
+              <w:rPr>
+                <w:rFonts w:ascii="Calibri" w:hAnsi="Calibri" w:eastAsia="微软雅黑"/>
+                <w:b w:val="0"/>
+                <w:sz w:val="19"/>
+              </w:rPr>
+              <w:t>Aqara G5 Pro 多篇评测（Basic Tutorials / Matter Alpha）</w:t>
+            </w:r>
+          </w:p>
+        </w:tc>
+        <w:tc>
+          <w:tcPr>
+            <w:tcW w:type="dxa" w:w="2379"/>
+            <w:shd w:val="clear" w:fill="EDF2F8"/>
+          </w:tcPr>
+          <w:p>
+            <w:r>
+              <w:rPr>
+                <w:rFonts w:ascii="Calibri" w:hAnsi="Calibri" w:eastAsia="微软雅黑"/>
+                <w:b w:val="0"/>
+                <w:sz w:val="19"/>
+              </w:rPr>
+              <w:t>出厂默认</w:t>
+            </w:r>
+            <w:r>
+              <w:rPr>
+                <w:rFonts w:ascii="Calibri" w:hAnsi="Calibri" w:eastAsia="微软雅黑"/>
+                <w:b/>
+                <w:sz w:val="19"/>
+              </w:rPr>
+              <w:t>偏敏感</w:t>
+            </w:r>
+            <w:r>
+              <w:rPr>
+                <w:rFonts w:ascii="Calibri" w:hAnsi="Calibri" w:eastAsia="微软雅黑"/>
+                <w:b w:val="0"/>
+                <w:sz w:val="19"/>
+              </w:rPr>
+              <w:t>，"不想每分钟收推送就得手动调灵敏度"；但夜间零误报，明显好于被雨点和飞虫频繁触发的前代 Reolink</w:t>
+            </w:r>
+          </w:p>
+        </w:tc>
+        <w:tc>
+          <w:tcPr>
+            <w:tcW w:type="dxa" w:w="2379"/>
+            <w:shd w:val="clear" w:fill="EDF2F8"/>
+          </w:tcPr>
+          <w:p>
+            <w:r>
+              <w:rPr>
+                <w:rFonts w:ascii="Calibri" w:hAnsi="Calibri" w:eastAsia="微软雅黑"/>
+                <w:b w:val="0"/>
+                <w:sz w:val="19"/>
+              </w:rPr>
+              <w:t>对应我方灵敏度三档设计与 7.5 夜间指标单列；"雨/虫触发"是夜间红外 FAR 的主要来源，验收负样本必须覆盖</w:t>
+            </w:r>
+          </w:p>
+        </w:tc>
+      </w:tr>
+      <w:tr>
+        <w:tc>
+          <w:tcPr>
+            <w:tcW w:type="dxa" w:w="2379"/>
+          </w:tcPr>
+          <w:p>
+            <w:r>
+              <w:rPr>
+                <w:rFonts w:ascii="Calibri" w:hAnsi="Calibri" w:eastAsia="微软雅黑"/>
+                <w:b w:val="0"/>
+                <w:sz w:val="19"/>
+              </w:rPr>
+              <w:t>C3</w:t>
+            </w:r>
+          </w:p>
+        </w:tc>
+        <w:tc>
+          <w:tcPr>
+            <w:tcW w:type="dxa" w:w="2379"/>
+          </w:tcPr>
+          <w:p>
+            <w:r>
+              <w:rPr>
+                <w:rFonts w:ascii="Calibri" w:hAnsi="Calibri" w:eastAsia="微软雅黑"/>
+                <w:b w:val="0"/>
+                <w:sz w:val="19"/>
+              </w:rPr>
+              <w:t>eufy 社区（官方论坛）</w:t>
+            </w:r>
+          </w:p>
+        </w:tc>
+        <w:tc>
+          <w:tcPr>
+            <w:tcW w:type="dxa" w:w="2379"/>
+          </w:tcPr>
+          <w:p>
+            <w:r>
+              <w:rPr>
+                <w:rFonts w:ascii="Calibri" w:hAnsi="Calibri" w:eastAsia="微软雅黑"/>
+                <w:b/>
+                <w:sz w:val="19"/>
+              </w:rPr>
+              <w:t>"每一个新访客都被误识别成已有家庭成员"，数月未新增任何新人员进库</w:t>
+            </w:r>
+            <w:r>
+              <w:rPr>
+                <w:rFonts w:ascii="Calibri" w:hAnsi="Calibri" w:eastAsia="微软雅黑"/>
+                <w:b w:val="0"/>
+                <w:sz w:val="19"/>
+              </w:rPr>
+              <w:t>——自学习系统把陌生人强行归入熟人</w:t>
+            </w:r>
+          </w:p>
+        </w:tc>
+        <w:tc>
+          <w:tcPr>
+            <w:tcW w:type="dxa" w:w="2379"/>
+          </w:tcPr>
+          <w:p>
+            <w:r>
+              <w:rPr>
+                <w:rFonts w:ascii="Calibri" w:hAnsi="Calibri" w:eastAsia="微软雅黑"/>
+                <w:b w:val="0"/>
+                <w:sz w:val="19"/>
+              </w:rPr>
+              <w:t>这是开放集识别（陌生人拒识）失效的典型案例，直接对应我方 S2 槽"陌生人被误认成熟人 FPIR≤1%"指标与"身份不确定输出 unknown 三态"设计；也提示自学习机制必须有拒识下限，不能为"越用越准"牺牲拒识</w:t>
+            </w:r>
+          </w:p>
+        </w:tc>
+      </w:tr>
+      <w:tr>
+        <w:tc>
+          <w:tcPr>
+            <w:tcW w:type="dxa" w:w="2379"/>
+            <w:shd w:val="clear" w:fill="EDF2F8"/>
+          </w:tcPr>
+          <w:p>
+            <w:r>
+              <w:rPr>
+                <w:rFonts w:ascii="Calibri" w:hAnsi="Calibri" w:eastAsia="微软雅黑"/>
+                <w:b w:val="0"/>
+                <w:sz w:val="19"/>
+              </w:rPr>
+              <w:t>C4</w:t>
+            </w:r>
+          </w:p>
+        </w:tc>
+        <w:tc>
+          <w:tcPr>
+            <w:tcW w:type="dxa" w:w="2379"/>
+            <w:shd w:val="clear" w:fill="EDF2F8"/>
+          </w:tcPr>
+          <w:p>
+            <w:r>
+              <w:rPr>
+                <w:rFonts w:ascii="Calibri" w:hAnsi="Calibri" w:eastAsia="微软雅黑"/>
+                <w:b w:val="0"/>
+                <w:sz w:val="19"/>
+              </w:rPr>
+              <w:t>Google Nest 社区 + 媒体报道（9to5Google/Pocketables）</w:t>
+            </w:r>
+          </w:p>
+        </w:tc>
+        <w:tc>
+          <w:tcPr>
+            <w:tcW w:type="dxa" w:w="2379"/>
+            <w:shd w:val="clear" w:fill="EDF2F8"/>
+          </w:tcPr>
+          <w:p>
+            <w:r>
+              <w:rPr>
+                <w:rFonts w:ascii="Calibri" w:hAnsi="Calibri" w:eastAsia="微软雅黑"/>
+                <w:b w:val="0"/>
+                <w:sz w:val="19"/>
+              </w:rPr>
+              <w:t xml:space="preserve">Familiar Faces </w:t>
+            </w:r>
+            <w:r>
+              <w:rPr>
+                <w:rFonts w:ascii="Calibri" w:hAnsi="Calibri" w:eastAsia="微软雅黑"/>
+                <w:b/>
+                <w:sz w:val="19"/>
+              </w:rPr>
+              <w:t>八年口碑不佳</w:t>
+            </w:r>
+            <w:r>
+              <w:rPr>
+                <w:rFonts w:ascii="Calibri" w:hAnsi="Calibri" w:eastAsia="微软雅黑"/>
+                <w:b w:val="0"/>
+                <w:sz w:val="19"/>
+              </w:rPr>
+              <w:t>：天天见的人认不出、妻子与陌生人混淆、小孩与来访朋友混淆；迁移 Gemini 后一度全设备识别停摆；</w:t>
+            </w:r>
+            <w:r>
+              <w:rPr>
+                <w:rFonts w:ascii="Calibri" w:hAnsi="Calibri" w:eastAsia="微软雅黑"/>
+                <w:b/>
+                <w:sz w:val="19"/>
+              </w:rPr>
+              <w:t>Gemini 日报把误识别结果写进每日总结</w:t>
+            </w:r>
+            <w:r>
+              <w:rPr>
+                <w:rFonts w:ascii="Calibri" w:hAnsi="Calibri" w:eastAsia="微软雅黑"/>
+                <w:b w:val="0"/>
+                <w:sz w:val="19"/>
+              </w:rPr>
+              <w:t>，放大了错误的可见性</w:t>
+            </w:r>
+          </w:p>
+        </w:tc>
+        <w:tc>
+          <w:tcPr>
+            <w:tcW w:type="dxa" w:w="2379"/>
+            <w:shd w:val="clear" w:fill="EDF2F8"/>
+          </w:tcPr>
+          <w:p>
+            <w:r>
+              <w:rPr>
+                <w:rFonts w:ascii="Calibri" w:hAnsi="Calibri" w:eastAsia="微软雅黑"/>
+                <w:b w:val="0"/>
+                <w:sz w:val="19"/>
+              </w:rPr>
+              <w:t>两个教训：① 人脸库质量管理（低质样本清理、最新样本自动更新、点赞/点踩反馈）是长期运营能力，Google 2026 年的修复三件套值得直接吸收进我方 4.5；② LLM 摘要会放大上游识别错误——我方"固定文案 + LLM 仅补充、描述与词槽冲突时以词槽为准"的双层设计正是针对此风险</w:t>
+            </w:r>
+          </w:p>
+        </w:tc>
+      </w:tr>
+      <w:tr>
+        <w:tc>
+          <w:tcPr>
+            <w:tcW w:type="dxa" w:w="2379"/>
+          </w:tcPr>
+          <w:p>
+            <w:r>
+              <w:rPr>
+                <w:rFonts w:ascii="Calibri" w:hAnsi="Calibri" w:eastAsia="微软雅黑"/>
+                <w:b w:val="0"/>
+                <w:sz w:val="19"/>
+              </w:rPr>
+              <w:t>C5</w:t>
+            </w:r>
+          </w:p>
+        </w:tc>
+        <w:tc>
+          <w:tcPr>
+            <w:tcW w:type="dxa" w:w="2379"/>
+          </w:tcPr>
+          <w:p>
+            <w:r>
+              <w:rPr>
+                <w:rFonts w:ascii="Calibri" w:hAnsi="Calibri" w:eastAsia="微软雅黑"/>
+                <w:b w:val="0"/>
+                <w:sz w:val="19"/>
+              </w:rPr>
+              <w:t>Ring Familiar Faces（TechCrunch 等）</w:t>
+            </w:r>
+          </w:p>
+        </w:tc>
+        <w:tc>
+          <w:tcPr>
+            <w:tcW w:type="dxa" w:w="2379"/>
+          </w:tcPr>
+          <w:p>
+            <w:r>
+              <w:rPr>
+                <w:rFonts w:ascii="Calibri" w:hAnsi="Calibri" w:eastAsia="微软雅黑"/>
+                <w:b w:val="0"/>
+                <w:sz w:val="19"/>
+              </w:rPr>
+              <w:t>云端人脸导致伊利诺伊/得州/波特兰无法上线，EFF 持续抗议</w:t>
+            </w:r>
+          </w:p>
+        </w:tc>
+        <w:tc>
+          <w:tcPr>
+            <w:tcW w:type="dxa" w:w="2379"/>
+          </w:tcPr>
+          <w:p>
+            <w:r>
+              <w:rPr>
+                <w:rFonts w:ascii="Calibri" w:hAnsi="Calibri" w:eastAsia="微软雅黑"/>
+                <w:b w:val="0"/>
+                <w:sz w:val="19"/>
+              </w:rPr>
+              <w:t>合规 case，见第 4 章发现 5</w:t>
+            </w:r>
+          </w:p>
+        </w:tc>
+      </w:tr>
+      <w:tr>
+        <w:tc>
+          <w:tcPr>
+            <w:tcW w:type="dxa" w:w="2379"/>
+            <w:shd w:val="clear" w:fill="EDF2F8"/>
+          </w:tcPr>
+          <w:p>
+            <w:r>
+              <w:rPr>
+                <w:rFonts w:ascii="Calibri" w:hAnsi="Calibri" w:eastAsia="微软雅黑"/>
+                <w:b w:val="0"/>
+                <w:sz w:val="19"/>
+              </w:rPr>
+              <w:t>C6</w:t>
+            </w:r>
+          </w:p>
+        </w:tc>
+        <w:tc>
+          <w:tcPr>
+            <w:tcW w:type="dxa" w:w="2379"/>
+            <w:shd w:val="clear" w:fill="EDF2F8"/>
+          </w:tcPr>
+          <w:p>
+            <w:r>
+              <w:rPr>
+                <w:rFonts w:ascii="Calibri" w:hAnsi="Calibri" w:eastAsia="微软雅黑"/>
+                <w:b w:val="0"/>
+                <w:sz w:val="19"/>
+              </w:rPr>
+              <w:t>Reolink 官方支持文档与社区</w:t>
+            </w:r>
+          </w:p>
+        </w:tc>
+        <w:tc>
+          <w:tcPr>
+            <w:tcW w:type="dxa" w:w="2379"/>
+            <w:shd w:val="clear" w:fill="EDF2F8"/>
+          </w:tcPr>
+          <w:p>
+            <w:r>
+              <w:rPr>
+                <w:rFonts w:ascii="Calibri" w:hAnsi="Calibri" w:eastAsia="微软雅黑"/>
+                <w:b w:val="0"/>
+                <w:sz w:val="19"/>
+              </w:rPr>
+              <w:t>Zone Loitering 需 ≥4 点多边形圈定；官方建议</w:t>
+            </w:r>
+            <w:r>
+              <w:rPr>
+                <w:rFonts w:ascii="Calibri" w:hAnsi="Calibri" w:eastAsia="微软雅黑"/>
+                <w:b/>
+                <w:sz w:val="19"/>
+              </w:rPr>
+              <w:t>白天灵敏度 10–50、夜间 1–10 分开调</w:t>
+            </w:r>
+            <w:r>
+              <w:rPr>
+                <w:rFonts w:ascii="Calibri" w:hAnsi="Calibri" w:eastAsia="微软雅黑"/>
+                <w:b w:val="0"/>
+                <w:sz w:val="19"/>
+              </w:rPr>
+              <w:t>；误报主因是雨、虫、小动物</w:t>
+            </w:r>
+          </w:p>
+        </w:tc>
+        <w:tc>
+          <w:tcPr>
+            <w:tcW w:type="dxa" w:w="2379"/>
+            <w:shd w:val="clear" w:fill="EDF2F8"/>
+          </w:tcPr>
+          <w:p>
+            <w:r>
+              <w:rPr>
+                <w:rFonts w:ascii="Calibri" w:hAnsi="Calibri" w:eastAsia="微软雅黑"/>
+                <w:b w:val="0"/>
+                <w:sz w:val="19"/>
+              </w:rPr>
+              <w:t>竞品中唯一与我方"圈定区域 + 徘徊"形态一致的落地实现；其"日夜灵敏度分开配置"的做法可作为我方灵敏度档位按布防时段自动切换的依据</w:t>
+            </w:r>
+          </w:p>
+        </w:tc>
+      </w:tr>
+      <w:tr>
+        <w:tc>
+          <w:tcPr>
+            <w:tcW w:type="dxa" w:w="2379"/>
+          </w:tcPr>
+          <w:p>
+            <w:r>
+              <w:rPr>
+                <w:rFonts w:ascii="Calibri" w:hAnsi="Calibri" w:eastAsia="微软雅黑"/>
+                <w:b w:val="0"/>
+                <w:sz w:val="19"/>
+              </w:rPr>
+              <w:t>C7</w:t>
+            </w:r>
+          </w:p>
+        </w:tc>
+        <w:tc>
+          <w:tcPr>
+            <w:tcW w:type="dxa" w:w="2379"/>
+          </w:tcPr>
+          <w:p>
+            <w:r>
+              <w:rPr>
+                <w:rFonts w:ascii="Calibri" w:hAnsi="Calibri" w:eastAsia="微软雅黑"/>
+                <w:b w:val="0"/>
+                <w:sz w:val="19"/>
+              </w:rPr>
+              <w:t>Aqara G4 门铃徘徊检测参数（官方 FAQ）</w:t>
+            </w:r>
+          </w:p>
+        </w:tc>
+        <w:tc>
+          <w:tcPr>
+            <w:tcW w:type="dxa" w:w="2379"/>
+          </w:tcPr>
+          <w:p>
+            <w:r>
+              <w:rPr>
+                <w:rFonts w:ascii="Calibri" w:hAnsi="Calibri" w:eastAsia="微软雅黑"/>
+                <w:b w:val="0"/>
+                <w:sz w:val="19"/>
+              </w:rPr>
+              <w:t>逗留判定时长</w:t>
+            </w:r>
+            <w:r>
+              <w:rPr>
+                <w:rFonts w:ascii="Calibri" w:hAnsi="Calibri" w:eastAsia="微软雅黑"/>
+                <w:b/>
+                <w:sz w:val="19"/>
+              </w:rPr>
+              <w:t>默认仅 3 秒</w:t>
+            </w:r>
+            <w:r>
+              <w:rPr>
+                <w:rFonts w:ascii="Calibri" w:hAnsi="Calibri" w:eastAsia="微软雅黑"/>
+                <w:b w:val="0"/>
+                <w:sz w:val="19"/>
+              </w:rPr>
+              <w:t>、可配置；文档明确提示"设太短会频繁触发、耗电"</w:t>
+            </w:r>
+          </w:p>
+        </w:tc>
+        <w:tc>
+          <w:tcPr>
+            <w:tcW w:type="dxa" w:w="2379"/>
+          </w:tcPr>
+          <w:p>
+            <w:r>
+              <w:rPr>
+                <w:rFonts w:ascii="Calibri" w:hAnsi="Calibri" w:eastAsia="微软雅黑"/>
+                <w:b w:val="0"/>
+                <w:sz w:val="19"/>
+              </w:rPr>
+              <w:t>竞品的消费级门铃把阈值压到 3s 换"不漏"，代价是误报和功耗——反衬我方 30s 默认值站在"少而准"一侧，且"阈值开放用户设置"有明确的竞品先例</w:t>
+            </w:r>
+          </w:p>
+        </w:tc>
+      </w:tr>
+    </w:tbl>
+    <w:p>
+      <w:pPr>
+        <w:spacing w:after="40"/>
+      </w:pPr>
+    </w:p>
+    <w:p>
+      <w:pPr>
+        <w:spacing w:before="200" w:after="120"/>
+        <w:outlineLvl w:val="2"/>
+      </w:pPr>
+      <w:r>
+        <w:rPr>
+          <w:rFonts w:ascii="Calibri" w:hAnsi="Calibri" w:eastAsia="微软雅黑"/>
+          <w:b/>
+          <w:color w:val="1F4E79"/>
+          <w:sz w:val="25"/>
+        </w:rPr>
+        <w:t>6.4 对我方的三点行动建议</w:t>
+      </w:r>
+    </w:p>
+    <w:p>
+      <w:pPr>
+        <w:spacing w:after="40"/>
+        <w:ind w:left="425" w:hanging="255"/>
+      </w:pPr>
+      <w:r>
+        <w:rPr>
+          <w:rFonts w:ascii="Calibri" w:hAnsi="Calibri" w:eastAsia="微软雅黑"/>
+          <w:b/>
+          <w:color w:val="1F4E79"/>
+          <w:sz w:val="21"/>
+        </w:rPr>
+        <w:t xml:space="preserve">1. </w:t>
+      </w:r>
+      <w:r>
+        <w:rPr>
+          <w:rFonts w:ascii="Calibri" w:hAnsi="Calibri" w:eastAsia="微软雅黑"/>
+          <w:b/>
+          <w:sz w:val="21"/>
+        </w:rPr>
+        <w:t>自建对比评测</w:t>
+      </w:r>
+      <w:r>
+        <w:rPr>
+          <w:rFonts w:ascii="Calibri" w:hAnsi="Calibri" w:eastAsia="微软雅黑"/>
+          <w:b w:val="0"/>
+          <w:sz w:val="21"/>
+        </w:rPr>
+        <w:t>：行业没有公开徘徊基准 → 采购 Reolink（有明确徘徊侦测）与 Aqara G5 Pro（有逗留告警）各 1–2 台，用我方第 9 章自建测试集的同一批片段跑同口径对比（事件级 P/R + FAR/日），形成内部对标数据。这是目前唯一能获得竞品真实准召的方法，成本低、两周可完成。</w:t>
+      </w:r>
+    </w:p>
+    <w:p>
+      <w:pPr>
+        <w:spacing w:after="40"/>
+        <w:ind w:left="425" w:hanging="255"/>
+      </w:pPr>
+      <w:r>
+        <w:rPr>
+          <w:rFonts w:ascii="Calibri" w:hAnsi="Calibri" w:eastAsia="微软雅黑"/>
+          <w:b/>
+          <w:color w:val="1F4E79"/>
+          <w:sz w:val="21"/>
+        </w:rPr>
+        <w:t xml:space="preserve">2. </w:t>
+      </w:r>
+      <w:r>
+        <w:rPr>
+          <w:rFonts w:ascii="Calibri" w:hAnsi="Calibri" w:eastAsia="微软雅黑"/>
+          <w:b/>
+          <w:sz w:val="21"/>
+        </w:rPr>
+        <w:t>把 C1–C4 case 直接转化为测试用例</w:t>
+      </w:r>
+      <w:r>
+        <w:rPr>
+          <w:rFonts w:ascii="Calibri" w:hAnsi="Calibri" w:eastAsia="微软雅黑"/>
+          <w:b w:val="0"/>
+          <w:sz w:val="21"/>
+        </w:rPr>
+        <w:t>：慢速路过、默认灵敏度下的推送频率、陌生人强行归熟人、人脸库脏样本累积，全部纳入验收测试集的负样本与长稳测试项。</w:t>
+      </w:r>
+    </w:p>
+    <w:p>
+      <w:pPr>
+        <w:spacing w:after="40"/>
+        <w:ind w:left="425" w:hanging="255"/>
+      </w:pPr>
+      <w:r>
+        <w:rPr>
+          <w:rFonts w:ascii="Calibri" w:hAnsi="Calibri" w:eastAsia="微软雅黑"/>
+          <w:b/>
+          <w:color w:val="1F4E79"/>
+          <w:sz w:val="21"/>
+        </w:rPr>
+        <w:t xml:space="preserve">3. </w:t>
+      </w:r>
+      <w:r>
+        <w:rPr>
+          <w:rFonts w:ascii="Calibri" w:hAnsi="Calibri" w:eastAsia="微软雅黑"/>
+          <w:b/>
+          <w:sz w:val="21"/>
+        </w:rPr>
+        <w:t>运营指标补位</w:t>
+      </w:r>
+      <w:r>
+        <w:rPr>
+          <w:rFonts w:ascii="Calibri" w:hAnsi="Calibri" w:eastAsia="微软雅黑"/>
+          <w:b w:val="0"/>
+          <w:sz w:val="21"/>
+        </w:rPr>
+        <w:t>：竞品的教训集中在"上线后劣化"（人脸库变脏、误报累积导致用户关功能）。建议在 PRD 北极星中的"用户告警关闭率 ≤5%"之外，增加上线后周期性回归：熟人库月度抽检正确率、FAR 周报，防止 C3/C4 式的长期劣化。</w:t>
+      </w:r>
+    </w:p>
+    <w:p>
+      <w:pPr>
+        <w:spacing w:before="280" w:after="120"/>
+        <w:outlineLvl w:val="1"/>
+      </w:pPr>
+      <w:r>
+        <w:rPr>
+          <w:rFonts w:ascii="Calibri" w:hAnsi="Calibri" w:eastAsia="微软雅黑"/>
+          <w:b/>
+          <w:color w:val="1F4E79"/>
+          <w:sz w:val="30"/>
+        </w:rPr>
+        <w:t>7. 参考资料</w:t>
       </w:r>
     </w:p>
     <w:p>
@@ -4200,6 +5351,259 @@
         </w:r>
       </w:hyperlink>
     </w:p>
+    <w:p>
+      <w:pPr>
+        <w:pStyle w:val="ListBullet"/>
+        <w:spacing w:after="40"/>
+      </w:pPr>
+      <w:r>
+        <w:rPr>
+          <w:rFonts w:ascii="Calibri" w:hAnsi="Calibri" w:eastAsia="微软雅黑"/>
+          <w:b w:val="0"/>
+          <w:sz w:val="21"/>
+        </w:rPr>
+        <w:t>算法效果与 Case（第 6 章）：</w:t>
+      </w:r>
+      <w:hyperlink r:id="rId31">
+        <w:r>
+          <w:rPr>
+            <w:u w:val="single"/>
+            <w:color w:val="0563C1"/>
+            <w:rFonts w:eastAsia="微软雅黑"/>
+            <w:sz w:val="21"/>
+          </w:rPr>
+          <w:t>Tom's Guide 六摄像头 AI 横评</w:t>
+        </w:r>
+      </w:hyperlink>
+      <w:r>
+        <w:rPr>
+          <w:rFonts w:ascii="Calibri" w:hAnsi="Calibri" w:eastAsia="微软雅黑"/>
+          <w:b w:val="0"/>
+          <w:sz w:val="21"/>
+        </w:rPr>
+        <w:t>；</w:t>
+      </w:r>
+      <w:hyperlink r:id="rId32">
+        <w:r>
+          <w:rPr>
+            <w:u w:val="single"/>
+            <w:color w:val="0563C1"/>
+            <w:rFonts w:eastAsia="微软雅黑"/>
+            <w:sz w:val="21"/>
+          </w:rPr>
+          <w:t>SmartHomeExplorer 聚合评分（含 47 条误报 case）</w:t>
+        </w:r>
+      </w:hyperlink>
+      <w:r>
+        <w:rPr>
+          <w:rFonts w:ascii="Calibri" w:hAnsi="Calibri" w:eastAsia="微软雅黑"/>
+          <w:b w:val="0"/>
+          <w:sz w:val="21"/>
+        </w:rPr>
+        <w:t>；</w:t>
+      </w:r>
+      <w:hyperlink r:id="rId33">
+        <w:r>
+          <w:rPr>
+            <w:u w:val="single"/>
+            <w:color w:val="0563C1"/>
+            <w:rFonts w:eastAsia="微软雅黑"/>
+            <w:sz w:val="21"/>
+          </w:rPr>
+          <w:t>Aqara G5 Pro 评测：慢走少年被判逗留（HomeKitNews）</w:t>
+        </w:r>
+      </w:hyperlink>
+      <w:r>
+        <w:rPr>
+          <w:rFonts w:ascii="Calibri" w:hAnsi="Calibri" w:eastAsia="微软雅黑"/>
+          <w:b w:val="0"/>
+          <w:sz w:val="21"/>
+        </w:rPr>
+        <w:t>；</w:t>
+      </w:r>
+      <w:hyperlink r:id="rId34">
+        <w:r>
+          <w:rPr>
+            <w:u w:val="single"/>
+            <w:color w:val="0563C1"/>
+            <w:rFonts w:eastAsia="微软雅黑"/>
+            <w:sz w:val="21"/>
+          </w:rPr>
+          <w:t>Aqara G5 Pro 评测：默认偏敏感/夜间零误报（Basic Tutorials）</w:t>
+        </w:r>
+      </w:hyperlink>
+      <w:r>
+        <w:rPr>
+          <w:rFonts w:ascii="Calibri" w:hAnsi="Calibri" w:eastAsia="微软雅黑"/>
+          <w:b w:val="0"/>
+          <w:sz w:val="21"/>
+        </w:rPr>
+        <w:t>；</w:t>
+      </w:r>
+      <w:hyperlink r:id="rId35">
+        <w:r>
+          <w:rPr>
+            <w:u w:val="single"/>
+            <w:color w:val="0563C1"/>
+            <w:rFonts w:eastAsia="微软雅黑"/>
+            <w:sz w:val="21"/>
+          </w:rPr>
+          <w:t>eufy 社区：新访客全部被误识别为家人</w:t>
+        </w:r>
+      </w:hyperlink>
+      <w:r>
+        <w:rPr>
+          <w:rFonts w:ascii="Calibri" w:hAnsi="Calibri" w:eastAsia="微软雅黑"/>
+          <w:b w:val="0"/>
+          <w:sz w:val="21"/>
+        </w:rPr>
+        <w:t>；</w:t>
+      </w:r>
+      <w:hyperlink r:id="rId36">
+        <w:r>
+          <w:rPr>
+            <w:u w:val="single"/>
+            <w:color w:val="0563C1"/>
+            <w:rFonts w:eastAsia="微软雅黑"/>
+            <w:sz w:val="21"/>
+          </w:rPr>
+          <w:t>Nest Familiar Faces 长期失准与 Gemini 修复（Pocketables）</w:t>
+        </w:r>
+      </w:hyperlink>
+      <w:r>
+        <w:rPr>
+          <w:rFonts w:ascii="Calibri" w:hAnsi="Calibri" w:eastAsia="微软雅黑"/>
+          <w:b w:val="0"/>
+          <w:sz w:val="21"/>
+        </w:rPr>
+        <w:t>；</w:t>
+      </w:r>
+      <w:hyperlink r:id="rId37">
+        <w:r>
+          <w:rPr>
+            <w:u w:val="single"/>
+            <w:color w:val="0563C1"/>
+            <w:rFonts w:eastAsia="微软雅黑"/>
+            <w:sz w:val="21"/>
+          </w:rPr>
+          <w:t>Google Home 修复 Familiar Faces（9to5Google）</w:t>
+        </w:r>
+      </w:hyperlink>
+      <w:r>
+        <w:rPr>
+          <w:rFonts w:ascii="Calibri" w:hAnsi="Calibri" w:eastAsia="微软雅黑"/>
+          <w:b w:val="0"/>
+          <w:sz w:val="21"/>
+        </w:rPr>
+        <w:t>；</w:t>
+      </w:r>
+      <w:hyperlink r:id="rId38">
+        <w:r>
+          <w:rPr>
+            <w:u w:val="single"/>
+            <w:color w:val="0563C1"/>
+            <w:rFonts w:eastAsia="微软雅黑"/>
+            <w:sz w:val="21"/>
+          </w:rPr>
+          <w:t>Nest 社区：识别停摆投诉帖</w:t>
+        </w:r>
+      </w:hyperlink>
+      <w:r>
+        <w:rPr>
+          <w:rFonts w:ascii="Calibri" w:hAnsi="Calibri" w:eastAsia="微软雅黑"/>
+          <w:b w:val="0"/>
+          <w:sz w:val="21"/>
+        </w:rPr>
+        <w:t>；</w:t>
+      </w:r>
+      <w:hyperlink r:id="rId39">
+        <w:r>
+          <w:rPr>
+            <w:u w:val="single"/>
+            <w:color w:val="0563C1"/>
+            <w:rFonts w:eastAsia="微软雅黑"/>
+            <w:sz w:val="21"/>
+          </w:rPr>
+          <w:t>Reolink 周界防护与徘徊配置指南</w:t>
+        </w:r>
+      </w:hyperlink>
+      <w:r>
+        <w:rPr>
+          <w:rFonts w:ascii="Calibri" w:hAnsi="Calibri" w:eastAsia="微软雅黑"/>
+          <w:b w:val="0"/>
+          <w:sz w:val="21"/>
+        </w:rPr>
+        <w:t>；</w:t>
+      </w:r>
+      <w:hyperlink r:id="rId40">
+        <w:r>
+          <w:rPr>
+            <w:u w:val="single"/>
+            <w:color w:val="0563C1"/>
+            <w:rFonts w:eastAsia="微软雅黑"/>
+            <w:sz w:val="21"/>
+          </w:rPr>
+          <w:t>Reolink 误报排查（日夜灵敏度建议）</w:t>
+        </w:r>
+      </w:hyperlink>
+      <w:r>
+        <w:rPr>
+          <w:rFonts w:ascii="Calibri" w:hAnsi="Calibri" w:eastAsia="微软雅黑"/>
+          <w:b w:val="0"/>
+          <w:sz w:val="21"/>
+        </w:rPr>
+        <w:t>；</w:t>
+      </w:r>
+      <w:hyperlink r:id="rId41">
+        <w:r>
+          <w:rPr>
+            <w:u w:val="single"/>
+            <w:color w:val="0563C1"/>
+            <w:rFonts w:eastAsia="微软雅黑"/>
+            <w:sz w:val="21"/>
+          </w:rPr>
+          <w:t>Aqara G4 门铃 FAQ（逗留默认 3s）</w:t>
+        </w:r>
+      </w:hyperlink>
+      <w:r>
+        <w:rPr>
+          <w:rFonts w:ascii="Calibri" w:hAnsi="Calibri" w:eastAsia="微软雅黑"/>
+          <w:b w:val="0"/>
+          <w:sz w:val="21"/>
+        </w:rPr>
+        <w:t>；</w:t>
+      </w:r>
+      <w:hyperlink r:id="rId42">
+        <w:r>
+          <w:rPr>
+            <w:u w:val="single"/>
+            <w:color w:val="0563C1"/>
+            <w:rFonts w:eastAsia="微软雅黑"/>
+            <w:sz w:val="21"/>
+          </w:rPr>
+          <w:t>Ring Video Descriptions 官方说明</w:t>
+        </w:r>
+      </w:hyperlink>
+      <w:r>
+        <w:rPr>
+          <w:rFonts w:ascii="Calibri" w:hAnsi="Calibri" w:eastAsia="微软雅黑"/>
+          <w:b w:val="0"/>
+          <w:sz w:val="21"/>
+        </w:rPr>
+        <w:t>；</w:t>
+      </w:r>
+      <w:hyperlink r:id="rId43">
+        <w:r>
+          <w:rPr>
+            <w:u w:val="single"/>
+            <w:color w:val="0563C1"/>
+            <w:rFonts w:eastAsia="微软雅黑"/>
+            <w:sz w:val="21"/>
+          </w:rPr>
+          <w:t>Ring AI 描述上手（MakeUseOf）</w:t>
+        </w:r>
+      </w:hyperlink>
+    </w:p>
     <w:sectPr>
       <w:pgSz w:w="12240" w:h="15840"/>
       <w:pgMar w:top="1247" w:right="1361" w:bottom="1247" w:left="1361" w:header="720" w:footer="720" w:gutter="0"/>

</xml_diff>